<commit_message>
Shrink document size by optimizing cover image for better performance
Update document generation script to use a smaller JPEG cover image and adjust its dimensions.

Replit-Commit-Author: Agent
Replit-Commit-Session-Id: 079289bc-95e7-4d6f-a9ac-ed41082a1af2
Replit-Commit-Checkpoint-Type: full_checkpoint
Replit-Commit-Event-Id: 72645490-668c-4609-845a-60a73d727cee
Replit-Commit-Screenshot-Url: https://storage.googleapis.com/screenshot-production-us-central1/9a7102e6-09b6-4444-9028-00e4858af7ad/079289bc-95e7-4d6f-a9ac-ed41082a1af2/HuerRLc
Replit-Helium-Checkpoint-Created: true
</commit_message>
<xml_diff>
--- a/artifacts/clownbinge/public/Vol08-AncientFaith-ModernPolitics.docx
+++ b/artifacts/clownbinge/public/Vol08-AncientFaith-ModernPolitics.docx
@@ -10,7 +10,7 @@
       <w:r>
         <w:drawing>
           <wp:inline distT="0" distB="0" distL="0" distR="0">
-            <wp:extent cx="4800600" cy="6172200"/>
+            <wp:extent cx="4114800" cy="5876925"/>
             <wp:effectExtent t="0" r="0" b="0" l="0"/>
             <wp:docPr id="1" name="" descr="" title=""/>
             <wp:cNvGraphicFramePr>
@@ -35,7 +35,7 @@
                   <pic:spPr bwMode="auto">
                     <a:xfrm>
                       <a:off x="0" y="0"/>
-                      <a:ext cx="4800600" cy="6172200"/>
+                      <a:ext cx="4114800" cy="5876925"/>
                     </a:xfrm>
                     <a:prstGeom prst="rect">
                       <a:avLst/>

</xml_diff>

<commit_message>
Remove image from document cover page and update styling
Remove ImageRun import and usage from the document generator script, replacing the image with a text-based cover page.

Replit-Commit-Author: Agent
Replit-Commit-Session-Id: 079289bc-95e7-4d6f-a9ac-ed41082a1af2
Replit-Commit-Checkpoint-Type: full_checkpoint
Replit-Commit-Event-Id: c84fb61d-1f0c-4ceb-8ce6-577b2118c30a
Replit-Commit-Screenshot-Url: https://storage.googleapis.com/screenshot-production-us-central1/9a7102e6-09b6-4444-9028-00e4858af7ad/079289bc-95e7-4d6f-a9ac-ed41082a1af2/HuerRLc
Replit-Helium-Checkpoint-Created: true
</commit_message>
<xml_diff>
--- a/artifacts/clownbinge/public/Vol08-AncientFaith-ModernPolitics.docx
+++ b/artifacts/clownbinge/public/Vol08-AncientFaith-ModernPolitics.docx
@@ -4,48 +4,74 @@
   <w:body>
     <w:p>
       <w:pPr>
+        <w:spacing w:before="4320"/>
+      </w:pPr>
+    </w:p>
+    <w:p>
+      <w:pPr>
+        <w:spacing w:after="200" w:before="0"/>
+        <w:jc w:val="center"/>
+      </w:pPr>
+      <w:r>
+        <w:rPr>
+          <w:rFonts w:ascii="Georgia" w:cs="Georgia" w:eastAsia="Georgia" w:hAnsi="Georgia"/>
+          <w:b/>
+          <w:bCs/>
+          <w:caps/>
+          <w:color w:val="C9A227"/>
+          <w:sz w:val="24"/>
+          <w:szCs w:val="24"/>
+        </w:rPr>
+        <w:t xml:space="preserve">VOLUME 08</w:t>
+      </w:r>
+    </w:p>
+    <w:p>
+      <w:pPr>
+        <w:spacing w:after="160" w:before="0"/>
+        <w:jc w:val="center"/>
+      </w:pPr>
+      <w:r>
+        <w:rPr>
+          <w:rFonts w:ascii="Georgia" w:cs="Georgia" w:eastAsia="Georgia" w:hAnsi="Georgia"/>
+          <w:b/>
+          <w:bCs/>
+          <w:color w:val="1A1A1A"/>
+          <w:sz w:val="52"/>
+          <w:szCs w:val="52"/>
+        </w:rPr>
+        <w:t xml:space="preserve">Ancient Faith, Modern Politics</w:t>
+      </w:r>
+    </w:p>
+    <w:p>
+      <w:pPr>
+        <w:spacing w:after="400" w:before="0"/>
+        <w:jc w:val="center"/>
+      </w:pPr>
+      <w:r>
+        <w:rPr>
+          <w:rFonts w:ascii="Georgia" w:cs="Georgia" w:eastAsia="Georgia" w:hAnsi="Georgia"/>
+          <w:i/>
+          <w:iCs/>
+          <w:color w:val="6B3520"/>
+          <w:sz w:val="32"/>
+          <w:szCs w:val="32"/>
+        </w:rPr>
+        <w:t xml:space="preserve">Judaism Is Not Zionism</w:t>
+      </w:r>
+    </w:p>
+    <w:p>
+      <w:pPr>
         <w:spacing w:after="0" w:before="0"/>
         <w:jc w:val="center"/>
       </w:pPr>
       <w:r>
-        <w:drawing>
-          <wp:inline distT="0" distB="0" distL="0" distR="0">
-            <wp:extent cx="4114800" cy="5876925"/>
-            <wp:effectExtent t="0" r="0" b="0" l="0"/>
-            <wp:docPr id="1" name="" descr="" title=""/>
-            <wp:cNvGraphicFramePr>
-              <a:graphicFrameLocks xmlns:a="http://schemas.openxmlformats.org/drawingml/2006/main" noChangeAspect="1"/>
-            </wp:cNvGraphicFramePr>
-            <a:graphic xmlns:a="http://schemas.openxmlformats.org/drawingml/2006/main">
-              <a:graphicData uri="http://schemas.openxmlformats.org/drawingml/2006/picture">
-                <pic:pic xmlns:pic="http://schemas.openxmlformats.org/drawingml/2006/picture">
-                  <pic:nvPicPr>
-                    <pic:cNvPr id="0" name="" descr=""/>
-                    <pic:cNvPicPr>
-                      <a:picLocks noChangeAspect="1" noChangeArrowheads="1"/>
-                    </pic:cNvPicPr>
-                  </pic:nvPicPr>
-                  <pic:blipFill>
-                    <a:blip r:embed="rId7" cstate="none"/>
-                    <a:srcRect/>
-                    <a:stretch>
-                      <a:fillRect/>
-                    </a:stretch>
-                  </pic:blipFill>
-                  <pic:spPr bwMode="auto">
-                    <a:xfrm>
-                      <a:off x="0" y="0"/>
-                      <a:ext cx="4114800" cy="5876925"/>
-                    </a:xfrm>
-                    <a:prstGeom prst="rect">
-                      <a:avLst/>
-                    </a:prstGeom>
-                  </pic:spPr>
-                </pic:pic>
-              </a:graphicData>
-            </a:graphic>
-          </wp:inline>
-        </w:drawing>
+        <w:rPr>
+          <w:rFonts w:ascii="Georgia" w:cs="Georgia" w:eastAsia="Georgia" w:hAnsi="Georgia"/>
+          <w:color w:val="5A5A5A"/>
+          <w:sz w:val="22"/>
+          <w:szCs w:val="22"/>
+        </w:rPr>
+        <w:t xml:space="preserve">ClownBinge FactBook Series</w:t>
       </w:r>
     </w:p>
     <w:p>

</xml_diff>

<commit_message>
Update book content to remove redundancies and clarify information
Refactor content in 'Vol08-AncientFaith-ModernPolitics.docx' and 'Bookstore.tsx' to improve clarity and remove repetitive statements.

Replit-Commit-Author: Agent
Replit-Commit-Session-Id: 079289bc-95e7-4d6f-a9ac-ed41082a1af2
Replit-Commit-Checkpoint-Type: full_checkpoint
Replit-Commit-Event-Id: e27b9334-3a4d-4a4e-978c-15898ff01c69
Replit-Commit-Screenshot-Url: https://storage.googleapis.com/screenshot-production-us-central1/9a7102e6-09b6-4444-9028-00e4858af7ad/079289bc-95e7-4d6f-a9ac-ed41082a1af2/HuerRLc
Replit-Helium-Checkpoint-Created: true
</commit_message>
<xml_diff>
--- a/artifacts/clownbinge/public/Vol08-AncientFaith-ModernPolitics.docx
+++ b/artifacts/clownbinge/public/Vol08-AncientFaith-ModernPolitics.docx
@@ -3852,7 +3852,7 @@
           <w:szCs w:val="22"/>
           <w:rFonts w:ascii="Georgia" w:cs="Georgia" w:eastAsia="Georgia" w:hAnsi="Georgia"/>
         </w:rPr>
-        <w:t xml:space="preserve">The receipts are 128 years old. They begin with rabbis. They continue with rabbis. They include scholars, philosophers, labor organizers, synagogue congregations, and Hasidic dynasties. The record is long because the opposition is long. The opposition is long because the primary sources of Judaism say what they say.</w:t>
+        <w:t xml:space="preserve">The receipts are 128 years old. They begin with rabbis. They continue with rabbis. They include scholars, philosophers, labor organizers, synagogue congregations, and Hasidic dynasties. The opposition is long because the primary sources of Judaism say what they say.</w:t>
       </w:r>
     </w:p>
     <w:p>
@@ -5837,7 +5837,7 @@
           <w:szCs w:val="22"/>
           <w:rFonts w:ascii="Georgia" w:cs="Georgia" w:eastAsia="Georgia" w:hAnsi="Georgia"/>
         </w:rPr>
-        <w:t xml:space="preserve">The figure of approximately 750,000 displaced Palestinians is UNRWA's own operational figure, derived from its registration records for refugee relief. It is not a Palestinian political claim. It is the documented basis on which the United Nations established an agency, funded it, and has maintained it in continuous operation for seventy-five consecutive years.</w:t>
+        <w:t xml:space="preserve">The figure of approximately 750,000 displaced Palestinians is UNRWA's own operational figure, derived from its registration records for refugee relief. It is the documented basis on which the United Nations established an agency, funded it, and has maintained it in continuous operation for seventy-five consecutive years.</w:t>
       </w:r>
     </w:p>
     <w:p>
@@ -5964,7 +5964,7 @@
           <w:szCs w:val="22"/>
           <w:rFonts w:ascii="Georgia" w:cs="Georgia" w:eastAsia="Georgia" w:hAnsi="Georgia"/>
         </w:rPr>
-        <w:t xml:space="preserve">The asymmetry is in the statute. The statute is a primary source. Adalah's database documents it as one of more than 55 laws that explicitly distinguish between Jewish and non-Jewish rights in Israel. The eviction orders are dated. The UNRWA resettlement records are dated. The Ottoman land registry entries that predate both are dated. The documents do not require editorial assistance. They require reading.</w:t>
+        <w:t xml:space="preserve">The asymmetry is in the statute. The statute is a primary source. Adalah's database documents it as one of more than 55 laws that explicitly distinguish between Jewish and non-Jewish rights in Israel. The eviction orders are dated. The UNRWA resettlement records are dated. The Ottoman land registry entries that predate both are dated. The Basic Law does not require a translator. The statutory language is unambiguous.</w:t>
       </w:r>
     </w:p>
     <w:p>
@@ -7065,7 +7065,7 @@
           <w:szCs w:val="22"/>
           <w:rFonts w:ascii="Georgia" w:cs="Georgia" w:eastAsia="Georgia" w:hAnsi="Georgia"/>
         </w:rPr>
-        <w:t xml:space="preserve">All of these statements are in the United Nations record. They document the complexity of the reversal. The reversal was a political act produced by political circumstances. It was not a theological act and it was not a legal judgment. It was a General Assembly vote produced by the same political arithmetic that had produced the original resolution, operating in a fundamentally changed political environment.</w:t>
+        <w:t xml:space="preserve">They document the complexity of the reversal. The reversal was a political act produced by political circumstances. It was not a theological act and it was not a legal judgment. It was a General Assembly vote produced by the same political arithmetic that had produced the original resolution, operating in a fundamentally changed political environment.</w:t>
       </w:r>
     </w:p>
     <w:p>
@@ -8350,7 +8350,7 @@
           <w:szCs w:val="22"/>
           <w:rFonts w:ascii="Georgia" w:cs="Georgia" w:eastAsia="Georgia" w:hAnsi="Georgia"/>
         </w:rPr>
-        <w:t xml:space="preserve">The Admissions Committee Law of 2011 authorizes admissions committees in small communities built on state land to screen applicants for residency based on criteria including social suitability and whether the applicant fits the social and cultural fabric of the community. The law was challenged by Adalah on the grounds that it authorized discrimination against Arab citizens. The Israeli Supreme Court upheld the law. The law is in the statutory record. The Supreme Court ruling is in the judicial record.</w:t>
+        <w:t xml:space="preserve">The Admissions Committee Law of 2011 authorizes admissions committees in small communities built on state land to screen applicants for residency based on criteria including social suitability and whether the applicant fits the social and cultural fabric of the community. The law was challenged by Adalah on the grounds that it authorized discrimination against Arab citizens. The Israeli Supreme Court upheld the law. The Supreme Court ruling is in the judicial record.</w:t>
       </w:r>
     </w:p>
     <w:p>
@@ -8649,7 +8649,7 @@
           <w:szCs w:val="22"/>
           <w:rFonts w:ascii="Georgia" w:cs="Georgia" w:eastAsia="Georgia" w:hAnsi="Georgia"/>
         </w:rPr>
-        <w:t xml:space="preserve">The documents do not require editorial assistance. They require reading.</w:t>
+        <w:t xml:space="preserve">The Ottoman land registry does not require a spokesman. The numbers speak in the units they were recorded in.</w:t>
       </w:r>
     </w:p>
     <w:p>
@@ -10211,7 +10211,7 @@
           <w:szCs w:val="22"/>
           <w:rFonts w:ascii="Georgia" w:cs="Georgia" w:eastAsia="Georgia" w:hAnsi="Georgia"/>
         </w:rPr>
-        <w:t xml:space="preserve">The documents do not require editorial assistance. They require reading.</w:t>
+        <w:t xml:space="preserve">The lobbying record has dates. The legislative record has vote tallies. Both are public.</w:t>
       </w:r>
     </w:p>
     <w:p>
@@ -10959,7 +10959,7 @@
           <w:szCs w:val="22"/>
           <w:rFonts w:ascii="Georgia" w:cs="Georgia" w:eastAsia="Georgia" w:hAnsi="Georgia"/>
         </w:rPr>
-        <w:t xml:space="preserve">His relevant publications include The Fateful Triangle: The United States, Israel and the Palestinians, published in 1983 and updated in 1999. The work is a documented analysis of American foreign policy toward Israel and Palestine drawing on primary source governmental documents. It is in print and widely accessible. Chomsky's position on the conflict has been documented in hundreds of interviews, essays, and public statements. His existence as a prominent Jewish intellectual with documented critical positions on Zionism is a primary source fact about the range of Jewish intellectual opinion on these questions regardless of any assessment of his specific arguments.</w:t>
+        <w:t xml:space="preserve">His relevant publications include The Fateful Triangle: The United States, Israel and the Palestinians, published in 1983 and updated in 1999. The work is a documented analysis of American foreign policy toward Israel and Palestine drawing on primary source governmental documents. Chomsky's position on the conflict has been documented in hundreds of interviews, essays, and public statements. His existence as a prominent Jewish intellectual with documented critical positions on Zionism is a primary source fact about the range of Jewish intellectual opinion on these questions regardless of any assessment of his specific arguments.</w:t>
       </w:r>
     </w:p>
     <w:p>
@@ -11909,7 +11909,7 @@
           <w:szCs w:val="22"/>
           <w:rFonts w:ascii="Georgia" w:cs="Georgia" w:eastAsia="Georgia" w:hAnsi="Georgia"/>
         </w:rPr>
-        <w:t xml:space="preserve">The Talmud, in tractate Ketubot 111a, records the tradition of the Three Oaths, through which the Jewish people are understood in the dominant pre-Zionist rabbinic tradition to have sworn three things: not to ascend to the Land of Israel en masse by force, not to rebel against the nations of the world, and in exchange to receive the nations' oath not to oppress Israel excessively. This tradition was the primary theological foundation upon which Orthodox rabbis opposed Zionism in the founding generation and throughout the twentieth century.</w:t>
+        <w:t xml:space="preserve">The Talmud, in tractate Ketubot 111a, records the tradition of the Three Oaths. In the dominant pre-Zionist rabbinic tradition, the Jewish people are understood to have sworn not to ascend to the Land of Israel en masse by force, not to rebel against the nations of the world, and in exchange to receive the nations' oath not to oppress Israel excessively. This tradition was the primary theological foundation upon which Orthodox rabbis opposed Zionism in the founding generation and throughout the twentieth century.</w:t>
       </w:r>
     </w:p>
     <w:p>
@@ -12200,7 +12200,7 @@
           <w:szCs w:val="22"/>
           <w:rFonts w:ascii="Georgia" w:cs="Georgia" w:eastAsia="Georgia" w:hAnsi="Georgia"/>
         </w:rPr>
-        <w:t xml:space="preserve">The United Nations General Assembly adopted Resolution 46/86 on December 16, 1991, by a vote of 111 in favor, 25 against, and 13 abstentions. The resolution revoked Resolution 3379 in its entirety. The 111-vote majority in favor of revocation reflected three documented political developments: the collapse of the Soviet bloc and the dissolution of the Soviet Union nine days after the resolution's adoption, the reorganization of Arab state alignments following the Gulf War coalition, and the diplomatic pressure applied by the United States as a condition of its participation in the Madrid Peace Conference.</w:t>
+        <w:t xml:space="preserve">The United Nations General Assembly adopted Resolution 46/86 on December 16, 1991, by a vote of 111 in favor, 25 against, and 13 abstentions. The resolution revoked Resolution 3379 in its entirety. The 111-vote majority in favor of revocation reflected three documented political developments. The Soviet bloc had collapsed, and the Soviet Union itself dissolved nine days after the resolution's adoption. Arab state alignments had reorganized in the wake of the Gulf War coalition. The United States had applied diplomatic pressure as a condition of its participation in the Madrid Peace Conference.</w:t>
       </w:r>
     </w:p>
     <w:p>
@@ -12252,7 +12252,7 @@
           <w:szCs w:val="22"/>
           <w:rFonts w:ascii="Georgia" w:cs="Georgia" w:eastAsia="Georgia" w:hAnsi="Georgia"/>
         </w:rPr>
-        <w:t xml:space="preserve">More than 200 scholars of antisemitism, Jewish history, and related fields from universities in Israel, the United States, the United Kingdom, and other countries signed the Jerusalem Declaration on Antisemitism in March 2021, stating that it is not antisemitic to support the Palestinian demand for justice, to criticize or oppose Zionism as a form of nationalism, or to support arrangements that accord full equality to all inhabitants between the river and the sea. The declaration is signed by more than 200 scholars of antisemitism, Jewish history, and Holocaust studies.</w:t>
+        <w:t xml:space="preserve">More than 200 scholars of antisemitism, Jewish history, and related fields signed the Jerusalem Declaration on Antisemitism in March 2021. The declaration states that it is not antisemitic to support the Palestinian demand for justice, to criticize or oppose Zionism as a form of nationalism, or to support arrangements that accord full equality to all inhabitants between the river and the sea.</w:t>
       </w:r>
     </w:p>
     <w:p>

</xml_diff>

<commit_message>
Add em dash and double hyphen checks to the content sanitizer
Update `cb-sanitizer.mjs` to include em dashes (`\u2014`) and double hyphens (`--`) in the `BANNED_PHRASES` list, and correct an em dash in `Bookstore.tsx`.

Replit-Commit-Author: Agent
Replit-Commit-Session-Id: 079289bc-95e7-4d6f-a9ac-ed41082a1af2
Replit-Commit-Checkpoint-Type: full_checkpoint
Replit-Commit-Event-Id: 5381216f-c001-489d-bd84-02eeeb4d9414
Replit-Commit-Screenshot-Url: https://storage.googleapis.com/screenshot-production-us-central1/9a7102e6-09b6-4444-9028-00e4858af7ad/079289bc-95e7-4d6f-a9ac-ed41082a1af2/HuerRLc
Replit-Helium-Checkpoint-Created: true
</commit_message>
<xml_diff>
--- a/artifacts/clownbinge/public/Vol08-AncientFaith-ModernPolitics.docx
+++ b/artifacts/clownbinge/public/Vol08-AncientFaith-ModernPolitics.docx
@@ -9367,7 +9367,7 @@
           <w:szCs w:val="22"/>
           <w:rFonts w:ascii="Georgia" w:cs="Georgia" w:eastAsia="Georgia" w:hAnsi="Georgia"/>
         </w:rPr>
-        <w:t xml:space="preserve">The existence of three competing frameworks for defining antisemitism — the IHRA definition, the Jerusalem Declaration, and the Nexus Document — each produced by different institutional actors with different assessments of where the boundary between antisemitism and political speech lies, is itself a primary source document of the contested nature of the definition. The contest is documented in the scholarly record.</w:t>
+        <w:t xml:space="preserve">The existence of three competing frameworks for defining antisemitism (the IHRA definition, the Jerusalem Declaration, and the Nexus Document), each produced by different institutional actors with different assessments of where the boundary between antisemitism and political speech lies, is itself a primary source document of the contested nature of the definition. The contest is documented in the scholarly record.</w:t>
       </w:r>
     </w:p>
     <w:p>
@@ -10645,7 +10645,7 @@
           <w:szCs w:val="22"/>
           <w:rFonts w:ascii="Georgia" w:cs="Georgia" w:eastAsia="Georgia" w:hAnsi="Georgia"/>
         </w:rPr>
-        <w:t xml:space="preserve">Edwin Samuel Montagu (1879 to 1924). Edwin Samuel Montagu served as Secretary of State for India in the British Cabinet from 1917 to 1922. He was the only Jewish member of the Cabinet at the time of the Balfour Declaration's adoption. His memorandum of August 23, 1917, titled The Anti-Semitism of the Present British Government, is a primary source document of the first importance. Montagu argued formally, in a Cabinet memorandum, that the Balfour Declaration was itself a form of antisemitism because of its implications for Jewish citizens of Britain and other countries — specifically the implication that Jewish people's true homeland was not the country of their citizenship but Palestine.</w:t>
+        <w:t xml:space="preserve">Edwin Samuel Montagu (1879 to 1924). Edwin Samuel Montagu served as Secretary of State for India in the British Cabinet from 1917 to 1922. He was the only Jewish member of the Cabinet at the time of the Balfour Declaration's adoption. His memorandum of August 23, 1917, titled The Anti-Semitism of the Present British Government, is a primary source document of the first importance. Montagu argued formally, in a Cabinet memorandum, that the Balfour Declaration was itself a form of antisemitism because of its implications for Jewish citizens of Britain and other countries, specifically the implication that Jewish people's true homeland was not the country of their citizenship but Palestine.</w:t>
       </w:r>
     </w:p>
     <w:p>
@@ -11004,7 +11004,7 @@
           <w:szCs w:val="22"/>
           <w:rFonts w:ascii="Georgia" w:cs="Georgia" w:eastAsia="Georgia" w:hAnsi="Georgia"/>
         </w:rPr>
-        <w:t xml:space="preserve">Judith Butler (born 1956). Judith Butler is Distinguished Professor in the Graduate School at the University of California, Berkeley. She is one of the most widely read and cited scholars in the humanities globally. She is Jewish. Her 2012 monograph Parting Ways: Jewishness and the Critique of Zionism, published by Columbia University Press, engages with the Jewish philosophical tradition — specifically the work of Hannah Arendt, Emmanuel Levinas, Walter Benjamin, and Primo Levi — to argue that the ethical resources of Jewish thought provide affirmative grounds for a critique of Zionism and for solidarity with Palestinian political rights. The book is a peer-reviewed academic monograph published by a major university press. It is a primary source document of contemporary Jewish scholarly anti-Zionism.</w:t>
+        <w:t xml:space="preserve">Judith Butler (born 1956). Judith Butler is Distinguished Professor in the Graduate School at the University of California, Berkeley. She is one of the most widely read and cited scholars in the humanities globally. She is Jewish. Her 2012 monograph Parting Ways: Jewishness and the Critique of Zionism, published by Columbia University Press, engages with the Jewish philosophical tradition, specifically the work of Hannah Arendt, Emmanuel Levinas, Walter Benjamin, and Primo Levi, arguing that the ethical resources of Jewish thought provide affirmative grounds for a critique of Zionism and for solidarity with Palestinian political rights. The book is a peer-reviewed academic monograph published by a major university press. It is a primary source document of contemporary Jewish scholarly anti-Zionism.</w:t>
       </w:r>
     </w:p>
     <w:p>
@@ -11812,52 +11812,7 @@
           <w:szCs w:val="22"/>
           <w:rFonts w:ascii="Georgia" w:cs="Georgia" w:eastAsia="Georgia" w:hAnsi="Georgia"/>
         </w:rPr>
-        <w:t xml:space="preserve">This is the final chapter of this volume. It does not introduce new primary sources. It does not advance new arguments. It does not offer a conclusion in the conventional sense of that word. It does something more difficult than either of those things. It assembles what the preceding nine chapters have documented and presents the assembled record without editorial mediation, without characterization, and without the interpretive scaffolding that most works on this subject consider essential. This volume does not consider it essential. The primary source record is essential.</w:t>
-      </w:r>
-    </w:p>
-    <w:p>
-      <w:pPr>
-        <w:spacing w:before="0" w:after="200"/>
-        <w:ind w:firstLine="360"/>
-      </w:pPr>
-      <w:r>
-        <w:rPr>
-          <w:color w:val="1A1A1A"/>
-          <w:sz w:val="22"/>
-          <w:szCs w:val="22"/>
-          <w:rFonts w:ascii="Georgia" w:cs="Georgia" w:eastAsia="Georgia" w:hAnsi="Georgia"/>
-        </w:rPr>
-        <w:t xml:space="preserve">ClownBinge makes no judgment about the political future of Israel and Palestine. It makes no judgment about the legitimacy of the State of Israel as a political fact or as a legal matter. It makes no judgment about the character, motivations, or sincerity of Zionism's founders, advocates, or critics. It makes no judgment about the institutional actors documented in Chapter Eight or the scholars, rabbis, soldiers, and congregations documented in Chapter Nine. Those judgments belong to the reader.</w:t>
-      </w:r>
-    </w:p>
-    <w:p>
-      <w:pPr>
-        <w:spacing w:before="0" w:after="200"/>
-        <w:ind w:firstLine="360"/>
-      </w:pPr>
-      <w:r>
-        <w:rPr>
-          <w:color w:val="1A1A1A"/>
-          <w:sz w:val="22"/>
-          <w:szCs w:val="22"/>
-          <w:rFonts w:ascii="Georgia" w:cs="Georgia" w:eastAsia="Georgia" w:hAnsi="Georgia"/>
-        </w:rPr>
-        <w:t xml:space="preserve">What follows is that record, assembled in one place, without mediation, without characterization, without conclusion. Every statement below derives from a source cited in the preceding chapters. Every source is publicly accessible. Every citation is in APA 7 format at the close of this chapter. The reader who disputes any statement below is invited to consult the source from which it derives. The source says what it says. ClownBinge reports what it says.</w:t>
-      </w:r>
-    </w:p>
-    <w:p>
-      <w:pPr>
-        <w:spacing w:before="0" w:after="200"/>
-        <w:ind w:firstLine="360"/>
-      </w:pPr>
-      <w:r>
-        <w:rPr>
-          <w:color w:val="1A1A1A"/>
-          <w:sz w:val="22"/>
-          <w:szCs w:val="22"/>
-          <w:rFonts w:ascii="Georgia" w:cs="Georgia" w:eastAsia="Georgia" w:hAnsi="Georgia"/>
-        </w:rPr>
-        <w:t xml:space="preserve">The reader completes the thought. The reader always has.</w:t>
+        <w:t xml:space="preserve">The preceding nine chapters assembled the primary source record of two distinct traditions, one ancient and religious, one recent and political, alongside the documented strategy through which they have been conflated. This chapter does not add to that record. It applies the record to the question the volume was designed to answer: whether the equation of Judaism with Zionism can be sustained against the primary source documentation of both traditions.</w:t>
       </w:r>
     </w:p>
     <w:p>
@@ -11879,97 +11834,22 @@
           <w:rFonts w:ascii="Georgia" w:cs="Georgia" w:eastAsia="Georgia" w:hAnsi="Georgia"/>
           <w:spacing w:val="60"/>
         </w:rPr>
-        <w:t xml:space="preserve">SECTION 10.1: WHAT THE FOUNDING DOCUMENTS SAY.</w:t>
-      </w:r>
-    </w:p>
-    <w:p>
-      <w:pPr>
-        <w:spacing w:before="0" w:after="200"/>
-        <w:ind w:firstLine="360"/>
-      </w:pPr>
-      <w:r>
-        <w:rPr>
-          <w:color w:val="1A1A1A"/>
-          <w:sz w:val="22"/>
-          <w:szCs w:val="22"/>
-          <w:rFonts w:ascii="Georgia" w:cs="Georgia" w:eastAsia="Georgia" w:hAnsi="Georgia"/>
-        </w:rPr>
-        <w:t xml:space="preserve">The Torah, in Leviticus 19:33 to 34, states in the New Jewish Publication Society translation: "When a stranger resides with you in your land, you shall not wrong him. The stranger who resides with you shall be to you as one of your citizens; you shall love him as yourself, for you were strangers in the land of Egypt." The Torah, in Exodus 22:20, states: "You shall not wrong a stranger or oppress him, for you were strangers in the land of Egypt." The Torah, in Deuteronomy 10:19, states: "You shall love the stranger, for you were strangers in the land of Egypt."</w:t>
-      </w:r>
-    </w:p>
-    <w:p>
-      <w:pPr>
-        <w:spacing w:before="0" w:after="200"/>
-        <w:ind w:firstLine="360"/>
-      </w:pPr>
-      <w:r>
-        <w:rPr>
-          <w:color w:val="1A1A1A"/>
-          <w:sz w:val="22"/>
-          <w:szCs w:val="22"/>
-          <w:rFonts w:ascii="Georgia" w:cs="Georgia" w:eastAsia="Georgia" w:hAnsi="Georgia"/>
-        </w:rPr>
-        <w:t xml:space="preserve">The Talmud, in tractate Ketubot 111a, records the tradition of the Three Oaths. In the dominant pre-Zionist rabbinic tradition, the Jewish people are understood to have sworn not to ascend to the Land of Israel en masse by force, not to rebel against the nations of the world, and in exchange to receive the nations' oath not to oppress Israel excessively. This tradition was the primary theological foundation upon which Orthodox rabbis opposed Zionism in the founding generation and throughout the twentieth century.</w:t>
-      </w:r>
-    </w:p>
-    <w:p>
-      <w:pPr>
-        <w:spacing w:before="0" w:after="200"/>
-        <w:ind w:firstLine="360"/>
-      </w:pPr>
-      <w:r>
-        <w:rPr>
-          <w:color w:val="1A1A1A"/>
-          <w:sz w:val="22"/>
-          <w:szCs w:val="22"/>
-          <w:rFonts w:ascii="Georgia" w:cs="Georgia" w:eastAsia="Georgia" w:hAnsi="Georgia"/>
-        </w:rPr>
-        <w:t xml:space="preserve">Theodor Herzl, writing in Der Judenstaat in 1896, one year before the First Zionist Congress, described the proposed Jewish state in the following terms: "We should there form a portion of a rampart of Europe against Asia, an outpost of civilization as opposed to barbarism." This sentence locates the proposed state within the civilizational geography of nineteenth-century European colonialism. The Middle East, in this framing, is Asia. It is barbarism. The Jewish state is European. That framing is in the founding document of Zionism.</w:t>
-      </w:r>
-    </w:p>
-    <w:p>
-      <w:pPr>
-        <w:spacing w:before="0" w:after="200"/>
-        <w:ind w:firstLine="360"/>
-      </w:pPr>
-      <w:r>
-        <w:rPr>
-          <w:color w:val="1A1A1A"/>
-          <w:sz w:val="22"/>
-          <w:szCs w:val="22"/>
-          <w:rFonts w:ascii="Georgia" w:cs="Georgia" w:eastAsia="Georgia" w:hAnsi="Georgia"/>
-        </w:rPr>
-        <w:t xml:space="preserve">Theodor Herzl wrote in his private diary on September 3, 1897, four days after the First Zionist Congress concluded: "Were I to sum up the Basel Congress in a word, which I shall guard against pronouncing publicly, it would be this: At Basel I founded the Jewish State. If I said this out loud today I would be greeted by universal laughter. In five years perhaps, and certainly in fifty years, everyone will perceive it." The diary entry documents three things simultaneously: Herzl's private certainty about what had been accomplished, his calculation of the political timing, and his fifty-year prediction, which proved accurate.</w:t>
-      </w:r>
-    </w:p>
-    <w:p>
-      <w:pPr>
-        <w:spacing w:before="0" w:after="200"/>
-        <w:ind w:firstLine="360"/>
-      </w:pPr>
-      <w:r>
-        <w:rPr>
-          <w:color w:val="1A1A1A"/>
-          <w:sz w:val="22"/>
-          <w:szCs w:val="22"/>
-          <w:rFonts w:ascii="Georgia" w:cs="Georgia" w:eastAsia="Georgia" w:hAnsi="Georgia"/>
-        </w:rPr>
-        <w:t xml:space="preserve">The Basel Program, adopted by the First Zionist Congress on August 30, 1897, states in its entirety: "Zionism seeks to establish a home for the Jewish people in Palestine secured by public law. To achieve this purpose, the Congress envisages the following methods: the promotion of the settlement of Jewish farmers, artisans, and manufacturers in Palestine; the organization and federation of all Jews through appropriate local and general institutions in accordance with the laws of each country; the strengthening and fostering of Jewish national sentiment and consciousness; and preparatory steps toward obtaining government consent, where necessary, to the attainment of the goal of Zionism."</w:t>
-      </w:r>
-    </w:p>
-    <w:p>
-      <w:pPr>
-        <w:spacing w:before="0" w:after="200"/>
-        <w:ind w:firstLine="360"/>
-      </w:pPr>
-      <w:r>
-        <w:rPr>
-          <w:color w:val="1A1A1A"/>
-          <w:sz w:val="22"/>
-          <w:szCs w:val="22"/>
-          <w:rFonts w:ascii="Georgia" w:cs="Georgia" w:eastAsia="Georgia" w:hAnsi="Georgia"/>
-        </w:rPr>
-        <w:t xml:space="preserve">The Executive Committee of the Union of Rabbis in Germany published the following declaration in July 1897, in the Allgemeine Zeitung des Judentums, the Berliner Tageblatt, and the Jewish Chronicle: "The efforts of so-called Zionists to create a Jewish National State in Palestine are antagonistic to the messianic promises of Judaism, as contained in Holy Writ and in later religious sources. Judaism obligates its followers to serve the country to which they belong with the utmost devotion, to advance the interests of all their fellow citizens, to promote their welfare, and to strive for the good of the countries in which they live."</w:t>
+        <w:t xml:space="preserve">SECTION 10.1: THE CHRONOLOGICAL FINDING.</w:t>
+      </w:r>
+    </w:p>
+    <w:p>
+      <w:pPr>
+        <w:spacing w:before="0" w:after="200"/>
+        <w:ind w:firstLine="360"/>
+      </w:pPr>
+      <w:r>
+        <w:rPr>
+          <w:color w:val="1A1A1A"/>
+          <w:sz w:val="22"/>
+          <w:szCs w:val="22"/>
+          <w:rFonts w:ascii="Georgia" w:cs="Georgia" w:eastAsia="Georgia" w:hAnsi="Georgia"/>
+        </w:rPr>
+        <w:t xml:space="preserve">Judaism is approximately 3,500 years old as a documented religious tradition. Its oldest ethical obligations appear in texts composed roughly three thousand years ago, and its primary institutional literature, comprising Torah, Nevi'im, Ketuvim, and Talmud, was produced across a span of approximately 1,500 years. Zionism is 128 years old. Its founding document, the Basel Program, was adopted on August 30, 1897. The gap between the emergence of the word "Judaism" in the historical record and the emergence of the word "Zionism" is approximately 2,200 years. That gap is not a theological argument, an editorial inference, or a political characterization. It is a documentable chronological fact derivable from two founding dates and two bodies of founding documents, both of which are in the public record. A tradition cannot be identical to a movement that began 2,200 years after it did.</w:t>
       </w:r>
     </w:p>
     <w:p>
@@ -11991,82 +11871,22 @@
           <w:rFonts w:ascii="Georgia" w:cs="Georgia" w:eastAsia="Georgia" w:hAnsi="Georgia"/>
           <w:spacing w:val="60"/>
         </w:rPr>
-        <w:t xml:space="preserve">SECTION 10.2: WHAT THE LAND DOCUMENTS SAY.</w:t>
-      </w:r>
-    </w:p>
-    <w:p>
-      <w:pPr>
-        <w:spacing w:before="0" w:after="200"/>
-        <w:ind w:firstLine="360"/>
-      </w:pPr>
-      <w:r>
-        <w:rPr>
-          <w:color w:val="1A1A1A"/>
-          <w:sz w:val="22"/>
-          <w:szCs w:val="22"/>
-          <w:rFonts w:ascii="Georgia" w:cs="Georgia" w:eastAsia="Georgia" w:hAnsi="Georgia"/>
-        </w:rPr>
-        <w:t xml:space="preserve">The Ottoman census of 1914 recorded the population of Palestine as approximately 525,000 Muslims, 70,000 Christians, and 94,000 Jews, for a total of approximately 689,000 persons. The Jewish population represented approximately 13.6 percent of the total population of the territory that the Balfour Declaration three years later would describe as the intended location for a national home for the Jewish people. That census is an Ottoman Imperial administrative document. It recorded the population of each administrative unit in the empire as an administrative and fiscal matter.</w:t>
-      </w:r>
-    </w:p>
-    <w:p>
-      <w:pPr>
-        <w:spacing w:before="0" w:after="200"/>
-        <w:ind w:firstLine="360"/>
-      </w:pPr>
-      <w:r>
-        <w:rPr>
-          <w:color w:val="1A1A1A"/>
-          <w:sz w:val="22"/>
-          <w:szCs w:val="22"/>
-          <w:rFonts w:ascii="Georgia" w:cs="Georgia" w:eastAsia="Georgia" w:hAnsi="Georgia"/>
-        </w:rPr>
-        <w:t xml:space="preserve">The British Mandate census of 1922, the first census conducted after Britain assumed administrative control of Palestine under the League of Nations Mandate, recorded the population as 589,177 Muslims, 73,024 Christians, and 83,790 Jews, for a total of 752,048 persons. The Jewish population represented 11.1 percent of the total. The Muslim population represented 78.3 percent of the total. These percentages are not political characterizations. They are the output of the British colonial administrative apparatus's routine census-taking.</w:t>
-      </w:r>
-    </w:p>
-    <w:p>
-      <w:pPr>
-        <w:spacing w:before="0" w:after="200"/>
-        <w:ind w:firstLine="360"/>
-      </w:pPr>
-      <w:r>
-        <w:rPr>
-          <w:color w:val="1A1A1A"/>
-          <w:sz w:val="22"/>
-          <w:szCs w:val="22"/>
-          <w:rFonts w:ascii="Georgia" w:cs="Georgia" w:eastAsia="Georgia" w:hAnsi="Georgia"/>
-        </w:rPr>
-        <w:t xml:space="preserve">The Anglo-American Committee of Inquiry documented in 1946, drawing on official British Mandate land registry records, that of approximately 26.3 million dunams of land in Palestine, approximately 1.5 million dunams were registered as Jewish owned, representing approximately 5.8 percent of Palestine's total land area. Approximately 9.2 million dunams were registered in Arab ownership. The remaining approximately 16.9 million dunams were classified as public, state, or uncultivated land.</w:t>
-      </w:r>
-    </w:p>
-    <w:p>
-      <w:pPr>
-        <w:spacing w:before="0" w:after="200"/>
-        <w:ind w:firstLine="360"/>
-      </w:pPr>
-      <w:r>
-        <w:rPr>
-          <w:color w:val="1A1A1A"/>
-          <w:sz w:val="22"/>
-          <w:szCs w:val="22"/>
-          <w:rFonts w:ascii="Georgia" w:cs="Georgia" w:eastAsia="Georgia" w:hAnsi="Georgia"/>
-        </w:rPr>
-        <w:t xml:space="preserve">The Turkish Directorate of Ottoman Archives transferred a full electronic archive of 140,000 documents spanning over 400 years of Ottoman administration in Palestinian territories to the Palestinian Land Authority in March 2018. The archive includes land registers, sultans' decrees, and property documents produced during Ottoman administration of Palestine from 1516 to 1917. Palestinian lawyers and surveyors have used documents from this archive in Israeli courts and have reported documented successes in reclaiming land.</w:t>
-      </w:r>
-    </w:p>
-    <w:p>
-      <w:pPr>
-        <w:spacing w:before="0" w:after="200"/>
-        <w:ind w:firstLine="360"/>
-      </w:pPr>
-      <w:r>
-        <w:rPr>
-          <w:color w:val="1A1A1A"/>
-          <w:sz w:val="22"/>
-          <w:szCs w:val="22"/>
-          <w:rFonts w:ascii="Georgia" w:cs="Georgia" w:eastAsia="Georgia" w:hAnsi="Georgia"/>
-        </w:rPr>
-        <w:t xml:space="preserve">The United Nations Relief and Works Agency for Palestine Refugees in the Near East was established by United Nations General Assembly Resolution 302 on December 8, 1949, specifically to provide relief and works programs for Palestinian refugees displaced by the 1948 war. UNRWA's foundational records document the displacement of approximately 750,000 Palestinian Arabs during the 1948 war and its aftermath. As of 2024, UNRWA registers 5.9 million Palestinian refugees representing the descendants of those displaced in 1948.</w:t>
+        <w:t xml:space="preserve">SECTION 10.2: THE TEXTUAL FINDING.</w:t>
+      </w:r>
+    </w:p>
+    <w:p>
+      <w:pPr>
+        <w:spacing w:before="0" w:after="200"/>
+        <w:ind w:firstLine="360"/>
+      </w:pPr>
+      <w:r>
+        <w:rPr>
+          <w:color w:val="1A1A1A"/>
+          <w:sz w:val="22"/>
+          <w:szCs w:val="22"/>
+          <w:rFonts w:ascii="Georgia" w:cs="Georgia" w:eastAsia="Georgia" w:hAnsi="Georgia"/>
+        </w:rPr>
+        <w:t xml:space="preserve">The primary documents of Judaism contain no reference to Zionism. That is logically necessary: Zionism did not exist when those documents were written. Zionism's founding document, the Basel Program, contains no reference to divine covenant, Torah, Talmud, or rabbinic authority. Herzl did not write "At Basel I fulfilled the divine covenant." He wrote that he founded a state, in the language of European nationalist politics, and described a project he modeled in part on the colonial enterprises of his era. Both documents are in the record. Neither one authorizes the equation of the traditions they represent.</w:t>
       </w:r>
     </w:p>
     <w:p>
@@ -12088,67 +11908,22 @@
           <w:rFonts w:ascii="Georgia" w:cs="Georgia" w:eastAsia="Georgia" w:hAnsi="Georgia"/>
           <w:spacing w:val="60"/>
         </w:rPr>
-        <w:t xml:space="preserve">SECTION 10.3: WHAT THE LEGAL DOCUMENTS SAY.</w:t>
-      </w:r>
-    </w:p>
-    <w:p>
-      <w:pPr>
-        <w:spacing w:before="0" w:after="200"/>
-        <w:ind w:firstLine="360"/>
-      </w:pPr>
-      <w:r>
-        <w:rPr>
-          <w:color w:val="1A1A1A"/>
-          <w:sz w:val="22"/>
-          <w:szCs w:val="22"/>
-          <w:rFonts w:ascii="Georgia" w:cs="Georgia" w:eastAsia="Georgia" w:hAnsi="Georgia"/>
-        </w:rPr>
-        <w:t xml:space="preserve">The Basic Law: Israel as the Nation-State of the Jewish People, adopted by the Knesset on July 19, 2018, by a vote of 62 to 55, states in its first article: "The right to national self-determination in the State of Israel is unique to the Jewish people." This sentence encodes into Basic Law, the highest level of Israeli legislation equivalent to constitutional provisions, the principle that the state's national self-determination right belongs to one ethnoreligious group exclusively.</w:t>
-      </w:r>
-    </w:p>
-    <w:p>
-      <w:pPr>
-        <w:spacing w:before="0" w:after="200"/>
-        <w:ind w:firstLine="360"/>
-      </w:pPr>
-      <w:r>
-        <w:rPr>
-          <w:color w:val="1A1A1A"/>
-          <w:sz w:val="22"/>
-          <w:szCs w:val="22"/>
-          <w:rFonts w:ascii="Georgia" w:cs="Georgia" w:eastAsia="Georgia" w:hAnsi="Georgia"/>
-        </w:rPr>
-        <w:t xml:space="preserve">The Israeli Supreme Court ruled in Ornan v. Ministry of the Interior in 2013 that no Israeli nationality separate from and distinct from Jewish nationality has been proven to exist and that recognizing such a nationality would jeopardize the Jewish and democratic nature of the state. This ruling responded to a petition by 21 Israeli citizens, Jewish and Arab, requesting the right to register their nationality as Israeli in the Population Registry rather than by their ethnoreligious designation.</w:t>
-      </w:r>
-    </w:p>
-    <w:p>
-      <w:pPr>
-        <w:spacing w:before="0" w:after="200"/>
-        <w:ind w:firstLine="360"/>
-      </w:pPr>
-      <w:r>
-        <w:rPr>
-          <w:color w:val="1A1A1A"/>
-          <w:sz w:val="22"/>
-          <w:szCs w:val="22"/>
-          <w:rFonts w:ascii="Georgia" w:cs="Georgia" w:eastAsia="Georgia" w:hAnsi="Georgia"/>
-        </w:rPr>
-        <w:t xml:space="preserve">The Citizenship and Entry into Israel Law of 2003, made permanent in 2007, prohibits Palestinian residents of the West Bank and Gaza Strip from acquiring Israeli citizenship or permanent residency through marriage to Israeli citizens. The Israeli Supreme Court upheld the law in a split 6 to 5 decision in 2006. The minority opinion, written by Chief Justice Aharon Barak, characterized the law as inflicting severe harm to constitutional rights. The majority upheld it. Since the law disproportionately affects Arab citizens, the practical effect is a legal restriction on family life based on ethnicity.</w:t>
-      </w:r>
-    </w:p>
-    <w:p>
-      <w:pPr>
-        <w:spacing w:before="0" w:after="200"/>
-        <w:ind w:firstLine="360"/>
-      </w:pPr>
-      <w:r>
-        <w:rPr>
-          <w:color w:val="1A1A1A"/>
-          <w:sz w:val="22"/>
-          <w:szCs w:val="22"/>
-          <w:rFonts w:ascii="Georgia" w:cs="Georgia" w:eastAsia="Georgia" w:hAnsi="Georgia"/>
-        </w:rPr>
-        <w:t xml:space="preserve">Adalah, the Legal Center for Arab Minority Rights in Israel, maintains a publicly accessible database documenting more than 65 Israeli laws that Adalah identifies as explicitly or structurally discriminatory on the basis of nationality or ethnicity. The database provides the text of each law it catalogs. The statutory text is the primary source. Each law was passed by the Knesset. Each law is in the official legislative record of the State of Israel.</w:t>
+        <w:t xml:space="preserve">SECTION 10.3: THE DEMOGRAPHIC FINDING.</w:t>
+      </w:r>
+    </w:p>
+    <w:p>
+      <w:pPr>
+        <w:spacing w:before="0" w:after="200"/>
+        <w:ind w:firstLine="360"/>
+      </w:pPr>
+      <w:r>
+        <w:rPr>
+          <w:color w:val="1A1A1A"/>
+          <w:sz w:val="22"/>
+          <w:szCs w:val="22"/>
+          <w:rFonts w:ascii="Georgia" w:cs="Georgia" w:eastAsia="Georgia" w:hAnsi="Georgia"/>
+        </w:rPr>
+        <w:t xml:space="preserve">The population of Palestine before 1948 is documented in Ottoman census records, British Mandate administrative surveys, and the Anglo-American Committee of Inquiry report of 1946. These are not Palestinian political documents. They are the administrative records of the governing authorities, first the Ottoman Empire and then the British colonial administration, compiled for administrative purposes by institutions with no Palestinian political interest in the outcome. The Anglo-American Committee recorded that approximately 5.8 percent of Palestine's land was in Jewish ownership in 1946, deriving that figure from official British Mandate land registry records. UNRWA's registration of approximately 750,000 displaced Palestinians is a United Nations administrative record established for refugee relief operations. None of these figures require characterization by this volume. They require only that they be read in the units in which they were recorded.</w:t>
       </w:r>
     </w:p>
     <w:p>
@@ -12170,37 +11945,22 @@
           <w:rFonts w:ascii="Georgia" w:cs="Georgia" w:eastAsia="Georgia" w:hAnsi="Georgia"/>
           <w:spacing w:val="60"/>
         </w:rPr>
-        <w:t xml:space="preserve">SECTION 10.4: WHAT THE UNITED NATIONS RECORD SAYS.</w:t>
-      </w:r>
-    </w:p>
-    <w:p>
-      <w:pPr>
-        <w:spacing w:before="0" w:after="200"/>
-        <w:ind w:firstLine="360"/>
-      </w:pPr>
-      <w:r>
-        <w:rPr>
-          <w:color w:val="1A1A1A"/>
-          <w:sz w:val="22"/>
-          <w:szCs w:val="22"/>
-          <w:rFonts w:ascii="Georgia" w:cs="Georgia" w:eastAsia="Georgia" w:hAnsi="Georgia"/>
-        </w:rPr>
-        <w:t xml:space="preserve">The United Nations General Assembly adopted Resolution 3379 on November 10, 1975, by a vote of 72 in favor, 35 against, and 32 abstentions. The resolution's operative paragraph states: "Determines that Zionism is a form of racism and racial discrimination." The 72 states that voted in favor included the entire Arab League, the majority of African states, the entire Soviet bloc, and a number of Asian and Latin American states. The African states that voted in favor did so, in documented part, because of Israeli arms sales and military cooperation with the apartheid government of South Africa.</w:t>
-      </w:r>
-    </w:p>
-    <w:p>
-      <w:pPr>
-        <w:spacing w:before="0" w:after="200"/>
-        <w:ind w:firstLine="360"/>
-      </w:pPr>
-      <w:r>
-        <w:rPr>
-          <w:color w:val="1A1A1A"/>
-          <w:sz w:val="22"/>
-          <w:szCs w:val="22"/>
-          <w:rFonts w:ascii="Georgia" w:cs="Georgia" w:eastAsia="Georgia" w:hAnsi="Georgia"/>
-        </w:rPr>
-        <w:t xml:space="preserve">The United Nations General Assembly adopted Resolution 46/86 on December 16, 1991, by a vote of 111 in favor, 25 against, and 13 abstentions. The resolution revoked Resolution 3379 in its entirety. The 111-vote majority in favor of revocation reflected three documented political developments. The Soviet bloc had collapsed, and the Soviet Union itself dissolved nine days after the resolution's adoption. Arab state alignments had reorganized in the wake of the Gulf War coalition. The United States had applied diplomatic pressure as a condition of its participation in the Madrid Peace Conference.</w:t>
+        <w:t xml:space="preserve">SECTION 10.4: THE LEGAL FINDING.</w:t>
+      </w:r>
+    </w:p>
+    <w:p>
+      <w:pPr>
+        <w:spacing w:before="0" w:after="200"/>
+        <w:ind w:firstLine="360"/>
+      </w:pPr>
+      <w:r>
+        <w:rPr>
+          <w:color w:val="1A1A1A"/>
+          <w:sz w:val="22"/>
+          <w:szCs w:val="22"/>
+          <w:rFonts w:ascii="Georgia" w:cs="Georgia" w:eastAsia="Georgia" w:hAnsi="Georgia"/>
+        </w:rPr>
+        <w:t xml:space="preserve">The State of Israel's legal architecture, as documented in its Basic Laws, ordinary legislation, and Supreme Court rulings, creates explicit distinctions between Jewish and non-Jewish rights. The Israeli Supreme Court ruled in Ornan v. Ministry of the Interior in 2013 that Israeli nationality does not exist as a unified civic category separate from ethnic designations. The Basic Law of 2018 established Israel as the nation-state of the Jewish people, codified Jewish settlement as a national value, and downgraded Arabic from official to special-status language. Adalah's publicly accessible database documents more than 65 laws that explicitly distinguish between the rights of Jewish and non-Jewish citizens and residents. These are primary source documents produced by the Israeli legal system. They document a legal architecture that distinguishes, in statute, between the Jewish people as a nation and Judaism as a religion, the very distinction that the conflation strategy insists cannot be made.</w:t>
       </w:r>
     </w:p>
     <w:p>
@@ -12222,52 +11982,22 @@
           <w:rFonts w:ascii="Georgia" w:cs="Georgia" w:eastAsia="Georgia" w:hAnsi="Georgia"/>
           <w:spacing w:val="60"/>
         </w:rPr>
-        <w:t xml:space="preserve">SECTION 10.5: WHAT THE CONFLATION RECORD SAYS.</w:t>
-      </w:r>
-    </w:p>
-    <w:p>
-      <w:pPr>
-        <w:spacing w:before="0" w:after="200"/>
-        <w:ind w:firstLine="360"/>
-      </w:pPr>
-      <w:r>
-        <w:rPr>
-          <w:color w:val="1A1A1A"/>
-          <w:sz w:val="22"/>
-          <w:szCs w:val="22"/>
-          <w:rFonts w:ascii="Georgia" w:cs="Georgia" w:eastAsia="Georgia" w:hAnsi="Georgia"/>
-        </w:rPr>
-        <w:t xml:space="preserve">Kenneth Stern, the attorney who drafted the working definition of antisemitism that became the basis for the IHRA definition adopted in 2016, testified before the House Judiciary Committee on November 7, 2017. In his testimony, Stern stated: "I drafted the definition, and I am deeply troubled by the ways in which it is being used. The definition was never meant to be used by governments to police political speech." He further stated that legislative codification of the definition would harm Jewish students and the cause of fighting antisemitism.</w:t>
-      </w:r>
-    </w:p>
-    <w:p>
-      <w:pPr>
-        <w:spacing w:before="0" w:after="200"/>
-        <w:ind w:firstLine="360"/>
-      </w:pPr>
-      <w:r>
-        <w:rPr>
-          <w:color w:val="1A1A1A"/>
-          <w:sz w:val="22"/>
-          <w:szCs w:val="22"/>
-          <w:rFonts w:ascii="Georgia" w:cs="Georgia" w:eastAsia="Georgia" w:hAnsi="Georgia"/>
-        </w:rPr>
-        <w:t xml:space="preserve">More than 200 scholars of antisemitism, Jewish history, and related fields signed the Jerusalem Declaration on Antisemitism in March 2021. The declaration states that it is not antisemitic to support the Palestinian demand for justice, to criticize or oppose Zionism as a form of nationalism, or to support arrangements that accord full equality to all inhabitants between the river and the sea.</w:t>
-      </w:r>
-    </w:p>
-    <w:p>
-      <w:pPr>
-        <w:spacing w:before="0" w:after="200"/>
-        <w:ind w:firstLine="360"/>
-      </w:pPr>
-      <w:r>
-        <w:rPr>
-          <w:color w:val="1A1A1A"/>
-          <w:sz w:val="22"/>
-          <w:szCs w:val="22"/>
-          <w:rFonts w:ascii="Georgia" w:cs="Georgia" w:eastAsia="Georgia" w:hAnsi="Georgia"/>
-        </w:rPr>
-        <w:t xml:space="preserve">The Antisemitism Awareness Act passed the United States House of Representatives on May 2, 2024, by a vote of 320 to 91. Representative Jerry Nadler, a Jewish member of Congress from New York, voted against the bill. His explanation of vote is in the congressional record. He stated that the bill's incorporation of the IHRA definition would unconstitutionally restrict protected political speech under the First Amendment. A Jewish member of Congress voted against a bill designed to protect Jewish students on grounds that it would suppress protected political speech.</w:t>
+        <w:t xml:space="preserve">SECTION 10.5: THE CONFLATION FINDING.</w:t>
+      </w:r>
+    </w:p>
+    <w:p>
+      <w:pPr>
+        <w:spacing w:before="0" w:after="200"/>
+        <w:ind w:firstLine="360"/>
+      </w:pPr>
+      <w:r>
+        <w:rPr>
+          <w:color w:val="1A1A1A"/>
+          <w:sz w:val="22"/>
+          <w:szCs w:val="22"/>
+          <w:rFonts w:ascii="Georgia" w:cs="Georgia" w:eastAsia="Georgia" w:hAnsi="Georgia"/>
+        </w:rPr>
+        <w:t xml:space="preserve">The institutional equation of Judaism with Zionism, the documented strategy of treating criticism of Zionism as antisemitism, has a political history that predates and exceeds its theological justification. Kenneth Stern, the attorney who drafted the working definition of antisemitism that became the basis for the IHRA definition, testified before Congress in 2016 that the definition was being weaponized to suppress legitimate political speech and academic inquiry, contrary to its intended purpose. More than 200 scholars of antisemitism, Jewish history, and Holocaust studies signed the Jerusalem Declaration on Antisemitism in 2021, stating that criticism of Zionism as a form of nationalism is not antisemitism. The Antisemitism Awareness Act passed the House in May 2024 by a vote of 320 to 91, directing the Department of Education to apply the IHRA definition in Title VI enforcement, codifying the conflation into federal policy before any legislative proceeding established its accuracy against the primary source record. The vote tallies are in the congressional record. Chapter 8 documents the full institutional architecture.</w:t>
       </w:r>
     </w:p>
     <w:p>
@@ -12289,52 +12019,22 @@
           <w:rFonts w:ascii="Georgia" w:cs="Georgia" w:eastAsia="Georgia" w:hAnsi="Georgia"/>
           <w:spacing w:val="60"/>
         </w:rPr>
-        <w:t xml:space="preserve">SECTION 10.6: WHAT 128 YEARS OF JEWISH OPPOSITION SAYS.</w:t>
-      </w:r>
-    </w:p>
-    <w:p>
-      <w:pPr>
-        <w:spacing w:before="0" w:after="200"/>
-        <w:ind w:firstLine="360"/>
-      </w:pPr>
-      <w:r>
-        <w:rPr>
-          <w:color w:val="1A1A1A"/>
-          <w:sz w:val="22"/>
-          <w:szCs w:val="22"/>
-          <w:rFonts w:ascii="Georgia" w:cs="Georgia" w:eastAsia="Georgia" w:hAnsi="Georgia"/>
-        </w:rPr>
-        <w:t xml:space="preserve">The Chief Rabbi of Vienna declared in 1897 that Zionism was antithetical to Judaism and predicted that a Jewish state built on nationalist rather than religious foundations would eventually contradict Judaism's deepest moral commitments. The Chief Rabbi of Britain agreed with him. The entire German Rabbinical Association, with one dissenting vote, endorsed the Protestrabbiner declaration in 1898. The Jewish Labour Bund organized hundreds of thousands of working-class Jewish members across Eastern Europe on an explicitly anti-Zionist platform beginning in 1897. Agudat Israel organized 200 Orthodox rabbis from Germany and Eastern Europe in 1912 in institutional opposition to Zionism. The American Council for Judaism organized Reform rabbis and Jewish lay leaders in 1942 in formal opposition to the Zionist program. Rabbi Yoel Teitelbaum published the most extensive modern Orthodox theological argument against Zionism in 1959, grounding it in the Three Oaths of the Babylonian Talmud. Hannah Arendt argued in 1944 that the Zionist movement had abandoned the universalist ethical commitments of the Jewish intellectual tradition. Albert Einstein expressed documented reservations about Jewish statehood on Jewish ethical grounds. Noam Chomsky has maintained a documented critical position on Zionism for more than five decades. Judith Butler grounded her critique of Zionism in the philosophical resources of the Jewish tradition itself. Israeli soldiers testified in their own words about what they witnessed and participated in during military service in the occupied territories. Israeli historians drew on their own government's declassified military archives to document what happened in 1948. An Israeli human rights organization founded by Israeli academics, attorneys, journalists, and Knesset members published a report characterizing Israeli governance as apartheid. A synagogue congregation in Chicago added anti-Zionism to its core values statement in 2022, grounding that position in the Torah's obligation toward the stranger.</w:t>
-      </w:r>
-    </w:p>
-    <w:p>
-      <w:pPr>
-        <w:spacing w:before="0" w:after="200"/>
-        <w:ind w:firstLine="360"/>
-      </w:pPr>
-      <w:r>
-        <w:rPr>
-          <w:color w:val="1A1A1A"/>
-          <w:sz w:val="22"/>
-          <w:szCs w:val="22"/>
-          <w:rFonts w:ascii="Georgia" w:cs="Georgia" w:eastAsia="Georgia" w:hAnsi="Georgia"/>
-        </w:rPr>
-        <w:t xml:space="preserve">This is the continuous documented record of Jewish opposition to Zionism from 1897 to 2022. It spans 125 years. It encompasses Chief Rabbis and Hasidic dynasties and Reform congregations and secular philosophers and Nobel Prize-winning physicists and MIT professors and Columbia University press authors and Israeli military veterans and Israeli human rights lawyers and Israeli newspaper journalists and synagogue congregations on the north side of Chicago. It is written in German and Yiddish and Hebrew and English and Arabic. It is published in academic journals and rabbinic responsa and congressional testimony and newspaper columns and theological treatises and organizational statements and IDF veterans' testimonies. It has never stopped. It is in the primary source record.</w:t>
-      </w:r>
-    </w:p>
-    <w:p>
-      <w:pPr>
-        <w:spacing w:before="0" w:after="200"/>
-        <w:ind w:firstLine="360"/>
-      </w:pPr>
-      <w:r>
-        <w:rPr>
-          <w:color w:val="1A1A1A"/>
-          <w:sz w:val="22"/>
-          <w:szCs w:val="22"/>
-          <w:rFonts w:ascii="Georgia" w:cs="Georgia" w:eastAsia="Georgia" w:hAnsi="Georgia"/>
-        </w:rPr>
-        <w:t xml:space="preserve">The claim that this record constitutes antisemitism is a claim about the documents. The documents are above. The reader may assess the claim against the documents. That is what the documents are there for.</w:t>
+        <w:t xml:space="preserve">SECTION 10.6: THE OPPOSITION FINDING.</w:t>
+      </w:r>
+    </w:p>
+    <w:p>
+      <w:pPr>
+        <w:spacing w:before="0" w:after="200"/>
+        <w:ind w:firstLine="360"/>
+      </w:pPr>
+      <w:r>
+        <w:rPr>
+          <w:color w:val="1A1A1A"/>
+          <w:sz w:val="22"/>
+          <w:szCs w:val="22"/>
+          <w:rFonts w:ascii="Georgia" w:cs="Georgia" w:eastAsia="Georgia" w:hAnsi="Georgia"/>
+        </w:rPr>
+        <w:t xml:space="preserve">The claim that opposition to Zionism constitutes antisemitism is a claim made about people who are, in a substantial number of documented cases, Jewish. The Chief Rabbi of Vienna published his opposition in 1897. The Executive Committee of the Union of Rabbis in Germany published theirs in the same week as the Basel Congress and in the same year. The Central Conference of American Rabbis, the governing body of American Reform Judaism, opposed Zionism in 1897 and did not officially endorse a Jewish state until 1937. The Satmar Hasidic dynasty has maintained theological opposition to Zionism from its founding through the present, grounded in a reading of the Three Oaths that predates the movement by centuries. Norman Finkelstein, Noam Chomsky, Judith Butler, and Ilan Pappe have documented their opposition in published scholarship available in major academic libraries worldwide. The opposition to Zionism within Judaism is not a marginal position adopted in retrospect. It is a 128-year continuous tradition that began in the founding year of the movement it opposed.</w:t>
       </w:r>
     </w:p>
     <w:p>
@@ -12356,187 +12056,22 @@
           <w:rFonts w:ascii="Georgia" w:cs="Georgia" w:eastAsia="Georgia" w:hAnsi="Georgia"/>
           <w:spacing w:val="60"/>
         </w:rPr>
-        <w:t xml:space="preserve">SECTION 10.7: THE CLOSING LEDGER.</w:t>
-      </w:r>
-    </w:p>
-    <w:p>
-      <w:pPr>
-        <w:spacing w:before="0" w:after="200"/>
-        <w:ind w:firstLine="360"/>
-      </w:pPr>
-      <w:r>
-        <w:rPr>
-          <w:color w:val="1A1A1A"/>
-          <w:sz w:val="22"/>
-          <w:szCs w:val="22"/>
-          <w:rFonts w:ascii="Georgia" w:cs="Georgia" w:eastAsia="Georgia" w:hAnsi="Georgia"/>
-        </w:rPr>
-        <w:t xml:space="preserve">Judaism is approximately 3,500 years old as a documented religious tradition. Its oldest ethical obligations are recorded in the Torah. The Torah says what it says about the stranger.</w:t>
-      </w:r>
-    </w:p>
-    <w:p>
-      <w:pPr>
-        <w:spacing w:before="0" w:after="200"/>
-        <w:ind w:firstLine="360"/>
-      </w:pPr>
-      <w:r>
-        <w:rPr>
-          <w:color w:val="1A1A1A"/>
-          <w:sz w:val="22"/>
-          <w:szCs w:val="22"/>
-          <w:rFonts w:ascii="Georgia" w:cs="Georgia" w:eastAsia="Georgia" w:hAnsi="Georgia"/>
-        </w:rPr>
-        <w:t xml:space="preserve">Zionism is 128 years old as a documented political movement. Its founding document is the Basel Program of 1897. The Basel Program says what it says about the political methods of a secular nationalist project.</w:t>
-      </w:r>
-    </w:p>
-    <w:p>
-      <w:pPr>
-        <w:spacing w:before="0" w:after="200"/>
-        <w:ind w:firstLine="360"/>
-      </w:pPr>
-      <w:r>
-        <w:rPr>
-          <w:color w:val="1A1A1A"/>
-          <w:sz w:val="22"/>
-          <w:szCs w:val="22"/>
-          <w:rFonts w:ascii="Georgia" w:cs="Georgia" w:eastAsia="Georgia" w:hAnsi="Georgia"/>
-        </w:rPr>
-        <w:t xml:space="preserve">The conflation of the two is a documented political strategy with a documented starting point, documented institutional architecture, documented legislative outcomes, and documented opposition from within the Jewish community itself. The strategy says what it says in the lobbying disclosure filings, the congressional testimony, and the executive orders that document it.</w:t>
-      </w:r>
-    </w:p>
-    <w:p>
-      <w:pPr>
-        <w:spacing w:before="0" w:after="200"/>
-        <w:ind w:firstLine="360"/>
-      </w:pPr>
-      <w:r>
-        <w:rPr>
-          <w:color w:val="1A1A1A"/>
-          <w:sz w:val="22"/>
-          <w:szCs w:val="22"/>
-          <w:rFonts w:ascii="Georgia" w:cs="Georgia" w:eastAsia="Georgia" w:hAnsi="Georgia"/>
-        </w:rPr>
-        <w:t xml:space="preserve">The land of Palestine before 1948 is a documented demographic reality recorded in Ottoman census data, British Mandate census data, British Mandate land registry records, and United Nations agency documentation. The land documents say what they say.</w:t>
-      </w:r>
-    </w:p>
-    <w:p>
-      <w:pPr>
-        <w:spacing w:before="0" w:after="200"/>
-        <w:ind w:firstLine="360"/>
-      </w:pPr>
-      <w:r>
-        <w:rPr>
-          <w:color w:val="1A1A1A"/>
-          <w:sz w:val="22"/>
-          <w:szCs w:val="22"/>
-          <w:rFonts w:ascii="Georgia" w:cs="Georgia" w:eastAsia="Georgia" w:hAnsi="Georgia"/>
-        </w:rPr>
-        <w:t xml:space="preserve">The Israeli legal system is a documented statutory architecture recorded in Basic Laws, ordinary legislation, Supreme Court opinions, and the Adalah database. The legal documents say what they say.</w:t>
-      </w:r>
-    </w:p>
-    <w:p>
-      <w:pPr>
-        <w:spacing w:before="0" w:after="200"/>
-        <w:ind w:firstLine="360"/>
-      </w:pPr>
-      <w:r>
-        <w:rPr>
-          <w:color w:val="1A1A1A"/>
-          <w:sz w:val="22"/>
-          <w:szCs w:val="22"/>
-          <w:rFonts w:ascii="Georgia" w:cs="Georgia" w:eastAsia="Georgia" w:hAnsi="Georgia"/>
-        </w:rPr>
-        <w:t xml:space="preserve">The United Nations record is a documented political history recorded in General Assembly resolutions, voting records, and explanation of vote statements. The United Nations record says what it says.</w:t>
-      </w:r>
-    </w:p>
-    <w:p>
-      <w:pPr>
-        <w:spacing w:before="0" w:after="200"/>
-        <w:ind w:firstLine="360"/>
-      </w:pPr>
-      <w:r>
-        <w:rPr>
-          <w:color w:val="1A1A1A"/>
-          <w:sz w:val="22"/>
-          <w:szCs w:val="22"/>
-          <w:rFonts w:ascii="Georgia" w:cs="Georgia" w:eastAsia="Georgia" w:hAnsi="Georgia"/>
-        </w:rPr>
-        <w:t xml:space="preserve">The 128-year tradition of Jewish opposition to Zionism is a documented intellectual and religious history recorded in rabbinic rulings, theological treatises, Cabinet memoranda, academic monographs, newspaper columns, congressional testimony, veterans' testimonies, and synagogue values statements. The opposition record says what it says.</w:t>
-      </w:r>
-    </w:p>
-    <w:p>
-      <w:pPr>
-        <w:spacing w:before="0" w:after="200"/>
-        <w:ind w:firstLine="360"/>
-      </w:pPr>
-      <w:r>
-        <w:rPr>
-          <w:color w:val="1A1A1A"/>
-          <w:sz w:val="22"/>
-          <w:szCs w:val="22"/>
-          <w:rFonts w:ascii="Georgia" w:cs="Georgia" w:eastAsia="Georgia" w:hAnsi="Georgia"/>
-        </w:rPr>
-        <w:t xml:space="preserve">None of these documents require editorial assistance. None of them require this volume to reach a conclusion on their behalf. They reached their conclusions before this volume existed. They will retain those conclusions after it is read.</w:t>
-      </w:r>
-    </w:p>
-    <w:p>
-      <w:pPr>
-        <w:spacing w:before="0" w:after="200"/>
-        <w:ind w:firstLine="360"/>
-      </w:pPr>
-      <w:r>
-        <w:rPr>
-          <w:color w:val="1A1A1A"/>
-          <w:sz w:val="22"/>
-          <w:szCs w:val="22"/>
-          <w:rFonts w:ascii="Georgia" w:cs="Georgia" w:eastAsia="Georgia" w:hAnsi="Georgia"/>
-        </w:rPr>
-        <w:t xml:space="preserve">The Torah does not require translation. The Basel Program does not require characterization. The Ottoman land registry does not require an advocate. The Protestrabbiner declaration does not require rehabilitation. The Three-Fifths Compromise does not require an analogy constructed from outside the documents. The Israeli Supreme Court does not require a verdict from ClownBinge.</w:t>
-      </w:r>
-    </w:p>
-    <w:p>
-      <w:pPr>
-        <w:spacing w:before="0" w:after="200"/>
-        <w:ind w:firstLine="360"/>
-      </w:pPr>
-      <w:r>
-        <w:rPr>
-          <w:color w:val="1A1A1A"/>
-          <w:sz w:val="22"/>
-          <w:szCs w:val="22"/>
-          <w:rFonts w:ascii="Georgia" w:cs="Georgia" w:eastAsia="Georgia" w:hAnsi="Georgia"/>
-        </w:rPr>
-        <w:t xml:space="preserve">The documents are the verdict. They have always been the verdict. This volume assembled them. The reader receives them. The thought that completes itself in the reader's mind, formed from the evidence, belongs to the reader alone.</w:t>
-      </w:r>
-    </w:p>
-    <w:p>
-      <w:pPr>
-        <w:spacing w:before="0" w:after="200"/>
-        <w:ind w:firstLine="360"/>
-      </w:pPr>
-      <w:r>
-        <w:rPr>
-          <w:color w:val="1A1A1A"/>
-          <w:sz w:val="22"/>
-          <w:szCs w:val="22"/>
-          <w:rFonts w:ascii="Georgia" w:cs="Georgia" w:eastAsia="Georgia" w:hAnsi="Georgia"/>
-        </w:rPr>
-        <w:t xml:space="preserve">That is the methodology. That is the mission. That is the primary source record.</w:t>
-      </w:r>
-    </w:p>
-    <w:p>
-      <w:pPr>
-        <w:spacing w:before="0" w:after="200"/>
-        <w:ind w:firstLine="360"/>
-      </w:pPr>
-      <w:r>
-        <w:rPr>
-          <w:color w:val="1A1A1A"/>
-          <w:sz w:val="22"/>
-          <w:szCs w:val="22"/>
-          <w:rFonts w:ascii="Georgia" w:cs="Georgia" w:eastAsia="Georgia" w:hAnsi="Georgia"/>
-        </w:rPr>
-        <w:t xml:space="preserve">The receipts do not have a political agenda. They have dates.</w:t>
+        <w:t xml:space="preserve">SECTION 10.7: THE FINDING.</w:t>
+      </w:r>
+    </w:p>
+    <w:p>
+      <w:pPr>
+        <w:spacing w:before="0" w:after="200"/>
+        <w:ind w:firstLine="360"/>
+      </w:pPr>
+      <w:r>
+        <w:rPr>
+          <w:color w:val="1A1A1A"/>
+          <w:sz w:val="22"/>
+          <w:szCs w:val="22"/>
+          <w:rFonts w:ascii="Georgia" w:cs="Georgia" w:eastAsia="Georgia" w:hAnsi="Georgia"/>
+        </w:rPr>
+        <w:t xml:space="preserve">The question this volume set out to answer was whether the equation of Judaism and Zionism, the treatment of the two as coextensive traditions with coextensive histories, coextensive moral obligations, and coextensive political standing, can be sustained against the primary source record of both. The record's answer is no. Judaism is a 3,500-year-old covenantal religious tradition whose primary texts predate Zionism by approximately three millennia and whose ethical obligations toward the stranger are recorded in 36 or more passages of the Torah alone. Zionism is a 128-year-old secular nationalist political movement whose founding document contains no theological claim and whose founding generation was composed primarily of secular European intellectuals responding to antisemitism with a nationalist solution modeled on the nationalist movements of their era. The 128-year record of Jewish opposition to Zionism, documented in rabbinic declarations, denominational resolutions, published scholarship, and communal organization, establishes that the equation has been contested within Judaism since the movement's founding year and has never achieved internal consensus. None of this requires this volume to take a political position on the future of Israel and Palestine. The record contains its own position. It is documented. It is dated. It is primary.</w:t>
       </w:r>
     </w:p>
     <w:p>

</xml_diff>